<commit_message>
Add G6 payment terms: R$20k down + 6 boleto installments
Co-authored-by: sarapizzico-hue <sarapizzico-hue@users.noreply.github.com>
</commit_message>
<xml_diff>
--- a/OBSERVACAO-CONTRATO-ENTREGAVEIS-G6.docx
+++ b/OBSERVACAO-CONTRATO-ENTREGAVEIS-G6.docx
@@ -5,7 +5,6 @@
     <w:p>
       <w:pPr>
         <w:spacing w:after="120"/>
-        <w:jc w:val="left"/>
       </w:pPr>
       <w:r>
         <w:rPr>
@@ -21,7 +20,6 @@
     <w:p>
       <w:pPr>
         <w:spacing w:after="80" w:line="276" w:lineRule="auto"/>
-        <w:ind w:firstLine="0"/>
       </w:pPr>
       <w:r>
         <w:rPr>
@@ -37,7 +35,6 @@
     <w:p>
       <w:pPr>
         <w:spacing w:after="80" w:line="276" w:lineRule="auto"/>
-        <w:ind w:firstLine="0"/>
       </w:pPr>
       <w:r>
         <w:rPr>
@@ -53,7 +50,6 @@
     <w:p>
       <w:pPr>
         <w:spacing w:after="80" w:line="276" w:lineRule="auto"/>
-        <w:ind w:firstLine="0"/>
       </w:pPr>
       <w:r>
         <w:rPr>
@@ -69,7 +65,6 @@
     <w:p>
       <w:pPr>
         <w:spacing w:after="80" w:line="276" w:lineRule="auto"/>
-        <w:ind w:firstLine="0"/>
       </w:pPr>
       <w:r>
         <w:rPr>
@@ -85,7 +80,6 @@
     <w:p>
       <w:pPr>
         <w:spacing w:after="80" w:line="276" w:lineRule="auto"/>
-        <w:ind w:firstLine="0"/>
       </w:pPr>
       <w:r>
         <w:rPr>
@@ -101,7 +95,6 @@
     <w:p>
       <w:pPr>
         <w:spacing w:after="80" w:line="276" w:lineRule="auto"/>
-        <w:ind w:firstLine="0"/>
       </w:pPr>
       <w:r>
         <w:rPr>
@@ -111,7 +104,7 @@
           <w:color w:val="1A1A1A"/>
           <w:sz w:val="20"/>
         </w:rPr>
-        <w:t>A presente Observação integra o instrumento contratual e descreve, de forma consolidada, os entregáveis, o formato de execução e os critérios de sucesso combinados entre as Partes para o projeto de Estruturação Comercial da G6 Internet.</w:t>
+        <w:t>A presente Observação integra o instrumento contratual e descreve, de forma consolidada, os entregáveis, o formato de execução, a forma de pagamento e os critérios de sucesso combinados entre as Partes para o projeto de Estruturação Comercial da G6 Internet.</w:t>
       </w:r>
     </w:p>
     <w:p>
@@ -132,7 +125,6 @@
     <w:p>
       <w:pPr>
         <w:spacing w:after="80" w:line="276" w:lineRule="auto"/>
-        <w:ind w:firstLine="0"/>
       </w:pPr>
       <w:r>
         <w:rPr>
@@ -148,7 +140,6 @@
     <w:p>
       <w:pPr>
         <w:spacing w:after="80" w:line="276" w:lineRule="auto"/>
-        <w:ind w:firstLine="0"/>
       </w:pPr>
       <w:r>
         <w:rPr>
@@ -178,7 +169,7 @@
     </w:p>
     <w:p>
       <w:pPr>
-        <w:spacing w:after="40" w:line="264" w:lineRule="auto"/>
+        <w:spacing w:after="40"/>
         <w:ind w:left="227"/>
       </w:pPr>
       <w:r>
@@ -194,7 +185,7 @@
     </w:p>
     <w:p>
       <w:pPr>
-        <w:spacing w:after="40" w:line="264" w:lineRule="auto"/>
+        <w:spacing w:after="40"/>
         <w:ind w:left="227"/>
       </w:pPr>
       <w:r>
@@ -210,7 +201,7 @@
     </w:p>
     <w:p>
       <w:pPr>
-        <w:spacing w:after="40" w:line="264" w:lineRule="auto"/>
+        <w:spacing w:after="40"/>
         <w:ind w:left="227"/>
       </w:pPr>
       <w:r>
@@ -226,7 +217,7 @@
     </w:p>
     <w:p>
       <w:pPr>
-        <w:spacing w:after="40" w:line="264" w:lineRule="auto"/>
+        <w:spacing w:after="40"/>
         <w:ind w:left="227"/>
       </w:pPr>
       <w:r>
@@ -242,7 +233,7 @@
     </w:p>
     <w:p>
       <w:pPr>
-        <w:spacing w:after="40" w:line="264" w:lineRule="auto"/>
+        <w:spacing w:after="40"/>
         <w:ind w:left="227"/>
       </w:pPr>
       <w:r>
@@ -258,7 +249,7 @@
     </w:p>
     <w:p>
       <w:pPr>
-        <w:spacing w:after="40" w:line="264" w:lineRule="auto"/>
+        <w:spacing w:after="40"/>
         <w:ind w:left="227"/>
       </w:pPr>
       <w:r>
@@ -274,7 +265,7 @@
     </w:p>
     <w:p>
       <w:pPr>
-        <w:spacing w:after="40" w:line="264" w:lineRule="auto"/>
+        <w:spacing w:after="40"/>
         <w:ind w:left="227"/>
       </w:pPr>
       <w:r>
@@ -290,7 +281,7 @@
     </w:p>
     <w:p>
       <w:pPr>
-        <w:spacing w:after="40" w:line="264" w:lineRule="auto"/>
+        <w:spacing w:after="40"/>
         <w:ind w:left="227"/>
       </w:pPr>
       <w:r>
@@ -322,7 +313,6 @@
     <w:p>
       <w:pPr>
         <w:spacing w:after="80" w:line="276" w:lineRule="auto"/>
-        <w:ind w:firstLine="0"/>
       </w:pPr>
       <w:r>
         <w:rPr>
@@ -337,7 +327,7 @@
     </w:p>
     <w:p>
       <w:pPr>
-        <w:spacing w:after="40" w:line="264" w:lineRule="auto"/>
+        <w:spacing w:after="40"/>
         <w:ind w:left="227"/>
       </w:pPr>
       <w:r>
@@ -353,7 +343,7 @@
     </w:p>
     <w:p>
       <w:pPr>
-        <w:spacing w:after="40" w:line="264" w:lineRule="auto"/>
+        <w:spacing w:after="40"/>
         <w:ind w:left="227"/>
       </w:pPr>
       <w:r>
@@ -369,7 +359,7 @@
     </w:p>
     <w:p>
       <w:pPr>
-        <w:spacing w:after="40" w:line="264" w:lineRule="auto"/>
+        <w:spacing w:after="40"/>
         <w:ind w:left="227"/>
       </w:pPr>
       <w:r>
@@ -385,7 +375,7 @@
     </w:p>
     <w:p>
       <w:pPr>
-        <w:spacing w:after="40" w:line="264" w:lineRule="auto"/>
+        <w:spacing w:after="40"/>
         <w:ind w:left="227"/>
       </w:pPr>
       <w:r>
@@ -402,7 +392,6 @@
     <w:p>
       <w:pPr>
         <w:spacing w:after="80" w:line="276" w:lineRule="auto"/>
-        <w:ind w:firstLine="0"/>
       </w:pPr>
       <w:r>
         <w:rPr>
@@ -417,7 +406,7 @@
     </w:p>
     <w:p>
       <w:pPr>
-        <w:spacing w:after="40" w:line="264" w:lineRule="auto"/>
+        <w:spacing w:after="40"/>
         <w:ind w:left="227"/>
       </w:pPr>
       <w:r>
@@ -433,7 +422,7 @@
     </w:p>
     <w:p>
       <w:pPr>
-        <w:spacing w:after="40" w:line="264" w:lineRule="auto"/>
+        <w:spacing w:after="40"/>
         <w:ind w:left="227"/>
       </w:pPr>
       <w:r>
@@ -449,7 +438,7 @@
     </w:p>
     <w:p>
       <w:pPr>
-        <w:spacing w:after="40" w:line="264" w:lineRule="auto"/>
+        <w:spacing w:after="40"/>
         <w:ind w:left="227"/>
       </w:pPr>
       <w:r>
@@ -465,7 +454,7 @@
     </w:p>
     <w:p>
       <w:pPr>
-        <w:spacing w:after="40" w:line="264" w:lineRule="auto"/>
+        <w:spacing w:after="40"/>
         <w:ind w:left="227"/>
       </w:pPr>
       <w:r>
@@ -497,7 +486,6 @@
     <w:p>
       <w:pPr>
         <w:spacing w:after="80" w:line="276" w:lineRule="auto"/>
-        <w:ind w:firstLine="0"/>
       </w:pPr>
       <w:r>
         <w:rPr>
@@ -513,7 +501,6 @@
     <w:p>
       <w:pPr>
         <w:spacing w:after="80" w:line="276" w:lineRule="auto"/>
-        <w:ind w:firstLine="0"/>
       </w:pPr>
       <w:r>
         <w:rPr>
@@ -528,7 +515,7 @@
     </w:p>
     <w:p>
       <w:pPr>
-        <w:spacing w:after="40" w:line="264" w:lineRule="auto"/>
+        <w:spacing w:after="40"/>
         <w:ind w:left="227"/>
       </w:pPr>
       <w:r>
@@ -544,7 +531,7 @@
     </w:p>
     <w:p>
       <w:pPr>
-        <w:spacing w:after="40" w:line="264" w:lineRule="auto"/>
+        <w:spacing w:after="40"/>
         <w:ind w:left="227"/>
       </w:pPr>
       <w:r>
@@ -560,7 +547,7 @@
     </w:p>
     <w:p>
       <w:pPr>
-        <w:spacing w:after="40" w:line="264" w:lineRule="auto"/>
+        <w:spacing w:after="40"/>
         <w:ind w:left="227"/>
       </w:pPr>
       <w:r>
@@ -576,7 +563,7 @@
     </w:p>
     <w:p>
       <w:pPr>
-        <w:spacing w:after="40" w:line="264" w:lineRule="auto"/>
+        <w:spacing w:after="40"/>
         <w:ind w:left="227"/>
       </w:pPr>
       <w:r>
@@ -592,7 +579,7 @@
     </w:p>
     <w:p>
       <w:pPr>
-        <w:spacing w:after="40" w:line="264" w:lineRule="auto"/>
+        <w:spacing w:after="40"/>
         <w:ind w:left="227"/>
       </w:pPr>
       <w:r>
@@ -609,7 +596,6 @@
     <w:p>
       <w:pPr>
         <w:spacing w:after="80" w:line="276" w:lineRule="auto"/>
-        <w:ind w:firstLine="0"/>
       </w:pPr>
       <w:r>
         <w:rPr>
@@ -624,7 +610,7 @@
     </w:p>
     <w:p>
       <w:pPr>
-        <w:spacing w:after="40" w:line="264" w:lineRule="auto"/>
+        <w:spacing w:after="40"/>
         <w:ind w:left="227"/>
       </w:pPr>
       <w:r>
@@ -640,7 +626,7 @@
     </w:p>
     <w:p>
       <w:pPr>
-        <w:spacing w:after="40" w:line="264" w:lineRule="auto"/>
+        <w:spacing w:after="40"/>
         <w:ind w:left="227"/>
       </w:pPr>
       <w:r>
@@ -656,7 +642,7 @@
     </w:p>
     <w:p>
       <w:pPr>
-        <w:spacing w:after="40" w:line="264" w:lineRule="auto"/>
+        <w:spacing w:after="40"/>
         <w:ind w:left="227"/>
       </w:pPr>
       <w:r>
@@ -672,7 +658,7 @@
     </w:p>
     <w:p>
       <w:pPr>
-        <w:spacing w:after="40" w:line="264" w:lineRule="auto"/>
+        <w:spacing w:after="40"/>
         <w:ind w:left="227"/>
       </w:pPr>
       <w:r>
@@ -688,7 +674,7 @@
     </w:p>
     <w:p>
       <w:pPr>
-        <w:spacing w:after="40" w:line="264" w:lineRule="auto"/>
+        <w:spacing w:after="40"/>
         <w:ind w:left="227"/>
       </w:pPr>
       <w:r>
@@ -704,7 +690,7 @@
     </w:p>
     <w:p>
       <w:pPr>
-        <w:spacing w:after="40" w:line="264" w:lineRule="auto"/>
+        <w:spacing w:after="40"/>
         <w:ind w:left="227"/>
       </w:pPr>
       <w:r>
@@ -721,7 +707,6 @@
     <w:p>
       <w:pPr>
         <w:spacing w:after="80" w:line="276" w:lineRule="auto"/>
-        <w:ind w:firstLine="0"/>
       </w:pPr>
       <w:r>
         <w:rPr>
@@ -736,7 +721,7 @@
     </w:p>
     <w:p>
       <w:pPr>
-        <w:spacing w:after="40" w:line="264" w:lineRule="auto"/>
+        <w:spacing w:after="40"/>
         <w:ind w:left="227"/>
       </w:pPr>
       <w:r>
@@ -752,7 +737,7 @@
     </w:p>
     <w:p>
       <w:pPr>
-        <w:spacing w:after="40" w:line="264" w:lineRule="auto"/>
+        <w:spacing w:after="40"/>
         <w:ind w:left="227"/>
       </w:pPr>
       <w:r>
@@ -768,7 +753,7 @@
     </w:p>
     <w:p>
       <w:pPr>
-        <w:spacing w:after="40" w:line="264" w:lineRule="auto"/>
+        <w:spacing w:after="40"/>
         <w:ind w:left="227"/>
       </w:pPr>
       <w:r>
@@ -784,7 +769,7 @@
     </w:p>
     <w:p>
       <w:pPr>
-        <w:spacing w:after="40" w:line="264" w:lineRule="auto"/>
+        <w:spacing w:after="40"/>
         <w:ind w:left="227"/>
       </w:pPr>
       <w:r>
@@ -800,7 +785,7 @@
     </w:p>
     <w:p>
       <w:pPr>
-        <w:spacing w:after="40" w:line="264" w:lineRule="auto"/>
+        <w:spacing w:after="40"/>
         <w:ind w:left="227"/>
       </w:pPr>
       <w:r>
@@ -816,7 +801,7 @@
     </w:p>
     <w:p>
       <w:pPr>
-        <w:spacing w:after="40" w:line="264" w:lineRule="auto"/>
+        <w:spacing w:after="40"/>
         <w:ind w:left="227"/>
       </w:pPr>
       <w:r>
@@ -833,7 +818,6 @@
     <w:p>
       <w:pPr>
         <w:spacing w:after="80" w:line="276" w:lineRule="auto"/>
-        <w:ind w:firstLine="0"/>
       </w:pPr>
       <w:r>
         <w:rPr>
@@ -848,7 +832,7 @@
     </w:p>
     <w:p>
       <w:pPr>
-        <w:spacing w:after="40" w:line="264" w:lineRule="auto"/>
+        <w:spacing w:after="40"/>
         <w:ind w:left="227"/>
       </w:pPr>
       <w:r>
@@ -864,7 +848,7 @@
     </w:p>
     <w:p>
       <w:pPr>
-        <w:spacing w:after="40" w:line="264" w:lineRule="auto"/>
+        <w:spacing w:after="40"/>
         <w:ind w:left="227"/>
       </w:pPr>
       <w:r>
@@ -880,7 +864,7 @@
     </w:p>
     <w:p>
       <w:pPr>
-        <w:spacing w:after="40" w:line="264" w:lineRule="auto"/>
+        <w:spacing w:after="40"/>
         <w:ind w:left="227"/>
       </w:pPr>
       <w:r>
@@ -896,7 +880,7 @@
     </w:p>
     <w:p>
       <w:pPr>
-        <w:spacing w:after="40" w:line="264" w:lineRule="auto"/>
+        <w:spacing w:after="40"/>
         <w:ind w:left="227"/>
       </w:pPr>
       <w:r>
@@ -913,7 +897,6 @@
     <w:p>
       <w:pPr>
         <w:spacing w:after="80" w:line="276" w:lineRule="auto"/>
-        <w:ind w:firstLine="0"/>
       </w:pPr>
       <w:r>
         <w:rPr>
@@ -928,7 +911,7 @@
     </w:p>
     <w:p>
       <w:pPr>
-        <w:spacing w:after="40" w:line="264" w:lineRule="auto"/>
+        <w:spacing w:after="40"/>
         <w:ind w:left="227"/>
       </w:pPr>
       <w:r>
@@ -944,7 +927,7 @@
     </w:p>
     <w:p>
       <w:pPr>
-        <w:spacing w:after="40" w:line="264" w:lineRule="auto"/>
+        <w:spacing w:after="40"/>
         <w:ind w:left="227"/>
       </w:pPr>
       <w:r>
@@ -960,7 +943,7 @@
     </w:p>
     <w:p>
       <w:pPr>
-        <w:spacing w:after="40" w:line="264" w:lineRule="auto"/>
+        <w:spacing w:after="40"/>
         <w:ind w:left="227"/>
       </w:pPr>
       <w:r>
@@ -976,7 +959,7 @@
     </w:p>
     <w:p>
       <w:pPr>
-        <w:spacing w:after="40" w:line="264" w:lineRule="auto"/>
+        <w:spacing w:after="40"/>
         <w:ind w:left="227"/>
       </w:pPr>
       <w:r>
@@ -992,7 +975,7 @@
     </w:p>
     <w:p>
       <w:pPr>
-        <w:spacing w:after="40" w:line="264" w:lineRule="auto"/>
+        <w:spacing w:after="40"/>
         <w:ind w:left="227"/>
       </w:pPr>
       <w:r>
@@ -1008,7 +991,7 @@
     </w:p>
     <w:p>
       <w:pPr>
-        <w:spacing w:after="40" w:line="264" w:lineRule="auto"/>
+        <w:spacing w:after="40"/>
         <w:ind w:left="227"/>
       </w:pPr>
       <w:r>
@@ -1025,7 +1008,6 @@
     <w:p>
       <w:pPr>
         <w:spacing w:after="80" w:line="276" w:lineRule="auto"/>
-        <w:ind w:firstLine="0"/>
       </w:pPr>
       <w:r>
         <w:rPr>
@@ -1040,7 +1022,7 @@
     </w:p>
     <w:p>
       <w:pPr>
-        <w:spacing w:after="40" w:line="264" w:lineRule="auto"/>
+        <w:spacing w:after="40"/>
         <w:ind w:left="227"/>
       </w:pPr>
       <w:r>
@@ -1056,7 +1038,7 @@
     </w:p>
     <w:p>
       <w:pPr>
-        <w:spacing w:after="40" w:line="264" w:lineRule="auto"/>
+        <w:spacing w:after="40"/>
         <w:ind w:left="227"/>
       </w:pPr>
       <w:r>
@@ -1072,7 +1054,7 @@
     </w:p>
     <w:p>
       <w:pPr>
-        <w:spacing w:after="40" w:line="264" w:lineRule="auto"/>
+        <w:spacing w:after="40"/>
         <w:ind w:left="227"/>
       </w:pPr>
       <w:r>
@@ -1088,7 +1070,7 @@
     </w:p>
     <w:p>
       <w:pPr>
-        <w:spacing w:after="40" w:line="264" w:lineRule="auto"/>
+        <w:spacing w:after="40"/>
         <w:ind w:left="227"/>
       </w:pPr>
       <w:r>
@@ -1104,7 +1086,7 @@
     </w:p>
     <w:p>
       <w:pPr>
-        <w:spacing w:after="40" w:line="264" w:lineRule="auto"/>
+        <w:spacing w:after="40"/>
         <w:ind w:left="227"/>
       </w:pPr>
       <w:r>
@@ -1121,7 +1103,6 @@
     <w:p>
       <w:pPr>
         <w:spacing w:after="80" w:line="276" w:lineRule="auto"/>
-        <w:ind w:firstLine="0"/>
       </w:pPr>
       <w:r>
         <w:rPr>
@@ -1152,7 +1133,6 @@
     <w:p>
       <w:pPr>
         <w:spacing w:after="80" w:line="276" w:lineRule="auto"/>
-        <w:ind w:firstLine="0"/>
       </w:pPr>
       <w:r>
         <w:rPr>
@@ -1167,7 +1147,7 @@
     </w:p>
     <w:p>
       <w:pPr>
-        <w:spacing w:after="40" w:line="264" w:lineRule="auto"/>
+        <w:spacing w:after="40"/>
         <w:ind w:left="227"/>
       </w:pPr>
       <w:r>
@@ -1183,7 +1163,7 @@
     </w:p>
     <w:p>
       <w:pPr>
-        <w:spacing w:after="40" w:line="264" w:lineRule="auto"/>
+        <w:spacing w:after="40"/>
         <w:ind w:left="227"/>
       </w:pPr>
       <w:r>
@@ -1199,7 +1179,7 @@
     </w:p>
     <w:p>
       <w:pPr>
-        <w:spacing w:after="40" w:line="264" w:lineRule="auto"/>
+        <w:spacing w:after="40"/>
         <w:ind w:left="227"/>
       </w:pPr>
       <w:r>
@@ -1215,7 +1195,7 @@
     </w:p>
     <w:p>
       <w:pPr>
-        <w:spacing w:after="40" w:line="264" w:lineRule="auto"/>
+        <w:spacing w:after="40"/>
         <w:ind w:left="227"/>
       </w:pPr>
       <w:r>
@@ -1231,7 +1211,7 @@
     </w:p>
     <w:p>
       <w:pPr>
-        <w:spacing w:after="40" w:line="264" w:lineRule="auto"/>
+        <w:spacing w:after="40"/>
         <w:ind w:left="227"/>
       </w:pPr>
       <w:r>
@@ -1247,7 +1227,7 @@
     </w:p>
     <w:p>
       <w:pPr>
-        <w:spacing w:after="40" w:line="264" w:lineRule="auto"/>
+        <w:spacing w:after="40"/>
         <w:ind w:left="227"/>
       </w:pPr>
       <w:r>
@@ -1263,7 +1243,7 @@
     </w:p>
     <w:p>
       <w:pPr>
-        <w:spacing w:after="40" w:line="264" w:lineRule="auto"/>
+        <w:spacing w:after="40"/>
         <w:ind w:left="227"/>
       </w:pPr>
       <w:r>
@@ -1279,7 +1259,7 @@
     </w:p>
     <w:p>
       <w:pPr>
-        <w:spacing w:after="40" w:line="264" w:lineRule="auto"/>
+        <w:spacing w:after="40"/>
         <w:ind w:left="227"/>
       </w:pPr>
       <w:r>
@@ -1296,7 +1276,6 @@
     <w:p>
       <w:pPr>
         <w:spacing w:after="80" w:line="276" w:lineRule="auto"/>
-        <w:ind w:firstLine="0"/>
       </w:pPr>
       <w:r>
         <w:rPr>
@@ -1326,7 +1305,7 @@
     </w:p>
     <w:p>
       <w:pPr>
-        <w:spacing w:after="40" w:line="264" w:lineRule="auto"/>
+        <w:spacing w:after="40"/>
         <w:ind w:left="227"/>
       </w:pPr>
       <w:r>
@@ -1342,7 +1321,7 @@
     </w:p>
     <w:p>
       <w:pPr>
-        <w:spacing w:after="40" w:line="264" w:lineRule="auto"/>
+        <w:spacing w:after="40"/>
         <w:ind w:left="227"/>
       </w:pPr>
       <w:r>
@@ -1358,7 +1337,7 @@
     </w:p>
     <w:p>
       <w:pPr>
-        <w:spacing w:after="40" w:line="264" w:lineRule="auto"/>
+        <w:spacing w:after="40"/>
         <w:ind w:left="227"/>
       </w:pPr>
       <w:r>
@@ -1374,7 +1353,7 @@
     </w:p>
     <w:p>
       <w:pPr>
-        <w:spacing w:after="40" w:line="264" w:lineRule="auto"/>
+        <w:spacing w:after="40"/>
         <w:ind w:left="227"/>
       </w:pPr>
       <w:r>
@@ -1390,7 +1369,7 @@
     </w:p>
     <w:p>
       <w:pPr>
-        <w:spacing w:after="40" w:line="264" w:lineRule="auto"/>
+        <w:spacing w:after="40"/>
         <w:ind w:left="227"/>
       </w:pPr>
       <w:r>
@@ -1421,7 +1400,7 @@
     </w:p>
     <w:p>
       <w:pPr>
-        <w:spacing w:after="40" w:line="264" w:lineRule="auto"/>
+        <w:spacing w:after="40"/>
         <w:ind w:left="227"/>
       </w:pPr>
       <w:r>
@@ -1437,7 +1416,7 @@
     </w:p>
     <w:p>
       <w:pPr>
-        <w:spacing w:after="40" w:line="264" w:lineRule="auto"/>
+        <w:spacing w:after="40"/>
         <w:ind w:left="227"/>
       </w:pPr>
       <w:r>
@@ -1453,7 +1432,7 @@
     </w:p>
     <w:p>
       <w:pPr>
-        <w:spacing w:after="40" w:line="264" w:lineRule="auto"/>
+        <w:spacing w:after="40"/>
         <w:ind w:left="227"/>
       </w:pPr>
       <w:r>
@@ -1469,7 +1448,7 @@
     </w:p>
     <w:p>
       <w:pPr>
-        <w:spacing w:after="40" w:line="264" w:lineRule="auto"/>
+        <w:spacing w:after="40"/>
         <w:ind w:left="227"/>
       </w:pPr>
       <w:r>
@@ -1485,7 +1464,7 @@
     </w:p>
     <w:p>
       <w:pPr>
-        <w:spacing w:after="40" w:line="264" w:lineRule="auto"/>
+        <w:spacing w:after="40"/>
         <w:ind w:left="227"/>
       </w:pPr>
       <w:r>
@@ -1511,12 +1490,27 @@
           <w:color w:val="A10F14"/>
           <w:sz w:val="24"/>
         </w:rPr>
-        <w:t>8. Investimento e condição comercial (referência)</w:t>
+        <w:t>8. Investimento e forma de pagamento</w:t>
       </w:r>
     </w:p>
     <w:p>
       <w:pPr>
-        <w:spacing w:after="40" w:line="264" w:lineRule="auto"/>
+        <w:spacing w:after="80" w:line="276" w:lineRule="auto"/>
+      </w:pPr>
+      <w:r>
+        <w:rPr>
+          <w:rFonts w:ascii="Calibri" w:hAnsi="Calibri" w:eastAsia="Calibri"/>
+          <w:b/>
+          <w:i w:val="0"/>
+          <w:color w:val="1A1A1A"/>
+          <w:sz w:val="22"/>
+        </w:rPr>
+        <w:t>8.1. Valores</w:t>
+      </w:r>
+    </w:p>
+    <w:p>
+      <w:pPr>
+        <w:spacing w:after="40"/>
         <w:ind w:left="227"/>
       </w:pPr>
       <w:r>
@@ -1527,12 +1521,12 @@
           <w:color w:val="1A1A1A"/>
           <w:sz w:val="22"/>
         </w:rPr>
-        <w:t>•  Valor de referência do produto: R$ 89.635,85.</w:t>
+        <w:t>•  Valor de referência do produto: R$ 89.635,85 (oitenta e nove mil, seiscentos e trinta e cinco reais e oitenta e cinco centavos).</w:t>
       </w:r>
     </w:p>
     <w:p>
       <w:pPr>
-        <w:spacing w:after="40" w:line="264" w:lineRule="auto"/>
+        <w:spacing w:after="40"/>
         <w:ind w:left="227"/>
       </w:pPr>
       <w:r>
@@ -1543,12 +1537,27 @@
           <w:color w:val="1A1A1A"/>
           <w:sz w:val="22"/>
         </w:rPr>
-        <w:t>•  Condição comercial G6 acordada na proposta: R$ 71.582,32.</w:t>
+        <w:t>•  Condição comercial G6 acordada: R$ 71.582,32 (setenta e um mil, quinhentos e oitenta e dois reais e trinta e dois centavos).</w:t>
       </w:r>
     </w:p>
     <w:p>
       <w:pPr>
-        <w:spacing w:after="40" w:line="264" w:lineRule="auto"/>
+        <w:spacing w:after="80" w:line="276" w:lineRule="auto"/>
+      </w:pPr>
+      <w:r>
+        <w:rPr>
+          <w:rFonts w:ascii="Calibri" w:hAnsi="Calibri" w:eastAsia="Calibri"/>
+          <w:b/>
+          <w:i w:val="0"/>
+          <w:color w:val="1A1A1A"/>
+          <w:sz w:val="22"/>
+        </w:rPr>
+        <w:t>8.2. Forma de pagamento (combinada entre as Partes)</w:t>
+      </w:r>
+    </w:p>
+    <w:p>
+      <w:pPr>
+        <w:spacing w:after="40"/>
         <w:ind w:left="227"/>
       </w:pPr>
       <w:r>
@@ -1559,13 +1568,76 @@
           <w:color w:val="1A1A1A"/>
           <w:sz w:val="22"/>
         </w:rPr>
-        <w:t>•  Condições de pagamento, reajuste, multa e vigência: conforme cláusulas do Contrato principal / proposta comercial assinada.</w:t>
+        <w:t>•  Entrada de R$ 20.000,00 (vinte mil reais), devida na assinatura / início do projeto, conforme orientação de faturamento da Contratada.</w:t>
       </w:r>
     </w:p>
     <w:p>
       <w:pPr>
+        <w:spacing w:after="40"/>
+        <w:ind w:left="227"/>
+      </w:pPr>
+      <w:r>
+        <w:rPr>
+          <w:rFonts w:ascii="Calibri" w:hAnsi="Calibri" w:eastAsia="Calibri"/>
+          <w:b w:val="0"/>
+          <w:i w:val="0"/>
+          <w:color w:val="1A1A1A"/>
+          <w:sz w:val="22"/>
+        </w:rPr>
+        <w:t>•  Saldo remanescente de R$ 51.582,32 (cinquenta e um mil, quinhentos e oitenta e dois reais e trinta e dois centavos), em 6 (seis) parcelas mensais via boleto bancário.</w:t>
+      </w:r>
+    </w:p>
+    <w:p>
+      <w:pPr>
+        <w:spacing w:after="40"/>
+        <w:ind w:left="227"/>
+      </w:pPr>
+      <w:r>
+        <w:rPr>
+          <w:rFonts w:ascii="Calibri" w:hAnsi="Calibri" w:eastAsia="Calibri"/>
+          <w:b w:val="0"/>
+          <w:i w:val="0"/>
+          <w:color w:val="1A1A1A"/>
+          <w:sz w:val="22"/>
+        </w:rPr>
+        <w:t>•  Valor de referência de cada parcela: R$ 8.597,05 (oito mil, quinhentos e noventa e sete reais e cinco centavos), com eventual ajuste de centavos na última parcela para totalizar exatamente o saldo de R$ 51.582,32.</w:t>
+      </w:r>
+    </w:p>
+    <w:p>
+      <w:pPr>
+        <w:spacing w:after="40"/>
+        <w:ind w:left="227"/>
+      </w:pPr>
+      <w:r>
+        <w:rPr>
+          <w:rFonts w:ascii="Calibri" w:hAnsi="Calibri" w:eastAsia="Calibri"/>
+          <w:b w:val="0"/>
+          <w:i w:val="0"/>
+          <w:color w:val="1A1A1A"/>
+          <w:sz w:val="22"/>
+        </w:rPr>
+        <w:t>•  Os boletos serão emitidos pela Contratada com vencimentos mensais sucessivos, a partir da data combinada no faturamento.</w:t>
+      </w:r>
+    </w:p>
+    <w:p>
+      <w:pPr>
+        <w:spacing w:after="40"/>
+        <w:ind w:left="227"/>
+      </w:pPr>
+      <w:r>
+        <w:rPr>
+          <w:rFonts w:ascii="Calibri" w:hAnsi="Calibri" w:eastAsia="Calibri"/>
+          <w:b w:val="0"/>
+          <w:i w:val="0"/>
+          <w:color w:val="1A1A1A"/>
+          <w:sz w:val="22"/>
+        </w:rPr>
+        <w:t>•  A falta de pagamento de qualquer parcela poderá ensejar as medidas previstas no Contrato principal (encargos, suspensão e/ou rescisão), sem prejuízo das demais cominações legais.</w:t>
+      </w:r>
+    </w:p>
+    <w:p>
+      <w:pPr>
         <w:spacing w:after="80" w:line="276" w:lineRule="auto"/>
-        <w:ind w:firstLine="0"/>
       </w:pPr>
       <w:r>
         <w:rPr>
@@ -1575,7 +1647,7 @@
           <w:color w:val="1A1A1A"/>
           <w:sz w:val="20"/>
         </w:rPr>
-        <w:t>Em caso de divergência entre materiais de apresentação (deck/PDF) e o Contrato, prevalece o Contrato, integrado por esta Observação quanto à lista de entregáveis.</w:t>
+        <w:t>Condições complementares de reajuste, multa, mora e vigência: conforme cláusulas do Contrato principal. Em caso de divergência entre materiais de apresentação (deck/PDF) e o Contrato, prevalece o Contrato, integrado por esta Observação quanto à lista de entregáveis e à forma de pagamento aqui descrita.</w:t>
       </w:r>
     </w:p>
     <w:p>
@@ -1595,7 +1667,7 @@
     </w:p>
     <w:p>
       <w:pPr>
-        <w:spacing w:after="40" w:line="264" w:lineRule="auto"/>
+        <w:spacing w:after="40"/>
         <w:ind w:left="227"/>
       </w:pPr>
       <w:r>
@@ -1611,7 +1683,7 @@
     </w:p>
     <w:p>
       <w:pPr>
-        <w:spacing w:after="40" w:line="264" w:lineRule="auto"/>
+        <w:spacing w:after="40"/>
         <w:ind w:left="227"/>
       </w:pPr>
       <w:r>
@@ -1627,7 +1699,7 @@
     </w:p>
     <w:p>
       <w:pPr>
-        <w:spacing w:after="40" w:line="264" w:lineRule="auto"/>
+        <w:spacing w:after="40"/>
         <w:ind w:left="227"/>
       </w:pPr>
       <w:r>
@@ -1644,7 +1716,6 @@
     <w:p>
       <w:pPr>
         <w:spacing w:after="80" w:line="276" w:lineRule="auto"/>
-        <w:ind w:firstLine="0"/>
       </w:pPr>
       <w:r>
         <w:rPr>
@@ -1654,7 +1725,7 @@
           <w:color w:val="1A1A1A"/>
           <w:sz w:val="20"/>
         </w:rPr>
-        <w:t>Tais materiais servem de apoio comercial e alinhamento; a lista vinculante de entregáveis para execução é a constante nesta Observação.</w:t>
+        <w:t>Tais materiais servem de apoio comercial e alinhamento; a lista vinculante de entregáveis e a forma de pagamento para execução são as constantes nesta Observação.</w:t>
       </w:r>
     </w:p>
     <w:p>
@@ -1675,7 +1746,6 @@
     <w:p>
       <w:pPr>
         <w:spacing w:after="80" w:line="276" w:lineRule="auto"/>
-        <w:ind w:firstLine="0"/>
       </w:pPr>
       <w:r>
         <w:rPr>
@@ -1685,7 +1755,7 @@
           <w:color w:val="1A1A1A"/>
           <w:sz w:val="22"/>
         </w:rPr>
-        <w:t>As Partes reconhecem que os entregáveis acima correspondem ao combinado para a Estruturação Comercial G6 e autorizam a inclusão deste texto como anexo/observação ao Contrato correspondente.</w:t>
+        <w:t>As Partes reconhecem que os entregáveis e a forma de pagamento acima correspondem ao combinado para a Estruturação Comercial G6 e autorizam a inclusão deste texto como anexo/observação ao Contrato correspondente.</w:t>
       </w:r>
     </w:p>
     <w:p>
@@ -1707,7 +1777,6 @@
     <w:p>
       <w:pPr>
         <w:spacing w:after="80" w:line="276" w:lineRule="auto"/>
-        <w:ind w:firstLine="0"/>
       </w:pPr>
       <w:r>
         <w:rPr>
@@ -1723,7 +1792,6 @@
     <w:p>
       <w:pPr>
         <w:spacing w:after="80" w:line="276" w:lineRule="auto"/>
-        <w:ind w:firstLine="0"/>
       </w:pPr>
       <w:r>
         <w:rPr>
@@ -1739,7 +1807,6 @@
     <w:p>
       <w:pPr>
         <w:spacing w:after="80" w:line="276" w:lineRule="auto"/>
-        <w:ind w:firstLine="0"/>
       </w:pPr>
       <w:r>
         <w:rPr>
@@ -1755,7 +1822,6 @@
     <w:p>
       <w:pPr>
         <w:spacing w:after="80" w:line="276" w:lineRule="auto"/>
-        <w:ind w:firstLine="0"/>
       </w:pPr>
       <w:r>
         <w:rPr>
@@ -1772,7 +1838,6 @@
     <w:p>
       <w:pPr>
         <w:spacing w:after="80" w:line="276" w:lineRule="auto"/>
-        <w:ind w:firstLine="0"/>
       </w:pPr>
       <w:r>
         <w:rPr>
@@ -1788,7 +1853,6 @@
     <w:p>
       <w:pPr>
         <w:spacing w:after="80" w:line="276" w:lineRule="auto"/>
-        <w:ind w:firstLine="0"/>
       </w:pPr>
       <w:r>
         <w:rPr>
@@ -1804,7 +1868,6 @@
     <w:p>
       <w:pPr>
         <w:spacing w:after="80" w:line="276" w:lineRule="auto"/>
-        <w:ind w:firstLine="0"/>
       </w:pPr>
       <w:r>
         <w:rPr>
@@ -1820,7 +1883,6 @@
     <w:p>
       <w:pPr>
         <w:spacing w:after="80" w:line="276" w:lineRule="auto"/>
-        <w:ind w:firstLine="0"/>
       </w:pPr>
       <w:r>
         <w:rPr>

</xml_diff>

<commit_message>
Update G6 contract observation with payment schedule
Co-authored-by: sarapizzico-hue <sarapizzico-hue@users.noreply.github.com>
</commit_message>
<xml_diff>
--- a/OBSERVACAO-CONTRATO-ENTREGAVEIS-G6.docx
+++ b/OBSERVACAO-CONTRATO-ENTREGAVEIS-G6.docx
@@ -5,7 +5,6 @@
     <w:p>
       <w:pPr>
         <w:spacing w:after="120"/>
-        <w:jc w:val="left"/>
       </w:pPr>
       <w:r>
         <w:rPr>
@@ -21,7 +20,6 @@
     <w:p>
       <w:pPr>
         <w:spacing w:after="80" w:line="276" w:lineRule="auto"/>
-        <w:ind w:firstLine="0"/>
       </w:pPr>
       <w:r>
         <w:rPr>
@@ -37,7 +35,6 @@
     <w:p>
       <w:pPr>
         <w:spacing w:after="80" w:line="276" w:lineRule="auto"/>
-        <w:ind w:firstLine="0"/>
       </w:pPr>
       <w:r>
         <w:rPr>
@@ -53,7 +50,6 @@
     <w:p>
       <w:pPr>
         <w:spacing w:after="80" w:line="276" w:lineRule="auto"/>
-        <w:ind w:firstLine="0"/>
       </w:pPr>
       <w:r>
         <w:rPr>
@@ -69,7 +65,6 @@
     <w:p>
       <w:pPr>
         <w:spacing w:after="80" w:line="276" w:lineRule="auto"/>
-        <w:ind w:firstLine="0"/>
       </w:pPr>
       <w:r>
         <w:rPr>
@@ -85,7 +80,6 @@
     <w:p>
       <w:pPr>
         <w:spacing w:after="80" w:line="276" w:lineRule="auto"/>
-        <w:ind w:firstLine="0"/>
       </w:pPr>
       <w:r>
         <w:rPr>
@@ -101,7 +95,6 @@
     <w:p>
       <w:pPr>
         <w:spacing w:after="80" w:line="276" w:lineRule="auto"/>
-        <w:ind w:firstLine="0"/>
       </w:pPr>
       <w:r>
         <w:rPr>
@@ -111,7 +104,7 @@
           <w:color w:val="1A1A1A"/>
           <w:sz w:val="20"/>
         </w:rPr>
-        <w:t>A presente Observação integra o instrumento contratual e descreve, de forma consolidada, os entregáveis, o formato de execução e os critérios de sucesso combinados entre as Partes para o projeto de Estruturação Comercial da G6 Internet.</w:t>
+        <w:t>A presente Observação integra o instrumento contratual e descreve, de forma consolidada, os entregáveis, o formato de execução, a forma de pagamento e os critérios de sucesso combinados entre as Partes para o projeto de Estruturação Comercial da G6 Internet.</w:t>
       </w:r>
     </w:p>
     <w:p>
@@ -132,7 +125,6 @@
     <w:p>
       <w:pPr>
         <w:spacing w:after="80" w:line="276" w:lineRule="auto"/>
-        <w:ind w:firstLine="0"/>
       </w:pPr>
       <w:r>
         <w:rPr>
@@ -148,7 +140,6 @@
     <w:p>
       <w:pPr>
         <w:spacing w:after="80" w:line="276" w:lineRule="auto"/>
-        <w:ind w:firstLine="0"/>
       </w:pPr>
       <w:r>
         <w:rPr>
@@ -178,7 +169,7 @@
     </w:p>
     <w:p>
       <w:pPr>
-        <w:spacing w:after="40" w:line="264" w:lineRule="auto"/>
+        <w:spacing w:after="40"/>
         <w:ind w:left="227"/>
       </w:pPr>
       <w:r>
@@ -194,7 +185,7 @@
     </w:p>
     <w:p>
       <w:pPr>
-        <w:spacing w:after="40" w:line="264" w:lineRule="auto"/>
+        <w:spacing w:after="40"/>
         <w:ind w:left="227"/>
       </w:pPr>
       <w:r>
@@ -210,7 +201,7 @@
     </w:p>
     <w:p>
       <w:pPr>
-        <w:spacing w:after="40" w:line="264" w:lineRule="auto"/>
+        <w:spacing w:after="40"/>
         <w:ind w:left="227"/>
       </w:pPr>
       <w:r>
@@ -226,7 +217,7 @@
     </w:p>
     <w:p>
       <w:pPr>
-        <w:spacing w:after="40" w:line="264" w:lineRule="auto"/>
+        <w:spacing w:after="40"/>
         <w:ind w:left="227"/>
       </w:pPr>
       <w:r>
@@ -242,7 +233,7 @@
     </w:p>
     <w:p>
       <w:pPr>
-        <w:spacing w:after="40" w:line="264" w:lineRule="auto"/>
+        <w:spacing w:after="40"/>
         <w:ind w:left="227"/>
       </w:pPr>
       <w:r>
@@ -258,7 +249,7 @@
     </w:p>
     <w:p>
       <w:pPr>
-        <w:spacing w:after="40" w:line="264" w:lineRule="auto"/>
+        <w:spacing w:after="40"/>
         <w:ind w:left="227"/>
       </w:pPr>
       <w:r>
@@ -274,7 +265,7 @@
     </w:p>
     <w:p>
       <w:pPr>
-        <w:spacing w:after="40" w:line="264" w:lineRule="auto"/>
+        <w:spacing w:after="40"/>
         <w:ind w:left="227"/>
       </w:pPr>
       <w:r>
@@ -290,7 +281,7 @@
     </w:p>
     <w:p>
       <w:pPr>
-        <w:spacing w:after="40" w:line="264" w:lineRule="auto"/>
+        <w:spacing w:after="40"/>
         <w:ind w:left="227"/>
       </w:pPr>
       <w:r>
@@ -322,7 +313,6 @@
     <w:p>
       <w:pPr>
         <w:spacing w:after="80" w:line="276" w:lineRule="auto"/>
-        <w:ind w:firstLine="0"/>
       </w:pPr>
       <w:r>
         <w:rPr>
@@ -337,7 +327,7 @@
     </w:p>
     <w:p>
       <w:pPr>
-        <w:spacing w:after="40" w:line="264" w:lineRule="auto"/>
+        <w:spacing w:after="40"/>
         <w:ind w:left="227"/>
       </w:pPr>
       <w:r>
@@ -353,7 +343,7 @@
     </w:p>
     <w:p>
       <w:pPr>
-        <w:spacing w:after="40" w:line="264" w:lineRule="auto"/>
+        <w:spacing w:after="40"/>
         <w:ind w:left="227"/>
       </w:pPr>
       <w:r>
@@ -369,7 +359,7 @@
     </w:p>
     <w:p>
       <w:pPr>
-        <w:spacing w:after="40" w:line="264" w:lineRule="auto"/>
+        <w:spacing w:after="40"/>
         <w:ind w:left="227"/>
       </w:pPr>
       <w:r>
@@ -385,7 +375,7 @@
     </w:p>
     <w:p>
       <w:pPr>
-        <w:spacing w:after="40" w:line="264" w:lineRule="auto"/>
+        <w:spacing w:after="40"/>
         <w:ind w:left="227"/>
       </w:pPr>
       <w:r>
@@ -402,7 +392,6 @@
     <w:p>
       <w:pPr>
         <w:spacing w:after="80" w:line="276" w:lineRule="auto"/>
-        <w:ind w:firstLine="0"/>
       </w:pPr>
       <w:r>
         <w:rPr>
@@ -417,7 +406,7 @@
     </w:p>
     <w:p>
       <w:pPr>
-        <w:spacing w:after="40" w:line="264" w:lineRule="auto"/>
+        <w:spacing w:after="40"/>
         <w:ind w:left="227"/>
       </w:pPr>
       <w:r>
@@ -433,7 +422,7 @@
     </w:p>
     <w:p>
       <w:pPr>
-        <w:spacing w:after="40" w:line="264" w:lineRule="auto"/>
+        <w:spacing w:after="40"/>
         <w:ind w:left="227"/>
       </w:pPr>
       <w:r>
@@ -449,7 +438,7 @@
     </w:p>
     <w:p>
       <w:pPr>
-        <w:spacing w:after="40" w:line="264" w:lineRule="auto"/>
+        <w:spacing w:after="40"/>
         <w:ind w:left="227"/>
       </w:pPr>
       <w:r>
@@ -465,7 +454,7 @@
     </w:p>
     <w:p>
       <w:pPr>
-        <w:spacing w:after="40" w:line="264" w:lineRule="auto"/>
+        <w:spacing w:after="40"/>
         <w:ind w:left="227"/>
       </w:pPr>
       <w:r>
@@ -497,7 +486,6 @@
     <w:p>
       <w:pPr>
         <w:spacing w:after="80" w:line="276" w:lineRule="auto"/>
-        <w:ind w:firstLine="0"/>
       </w:pPr>
       <w:r>
         <w:rPr>
@@ -513,7 +501,6 @@
     <w:p>
       <w:pPr>
         <w:spacing w:after="80" w:line="276" w:lineRule="auto"/>
-        <w:ind w:firstLine="0"/>
       </w:pPr>
       <w:r>
         <w:rPr>
@@ -528,7 +515,7 @@
     </w:p>
     <w:p>
       <w:pPr>
-        <w:spacing w:after="40" w:line="264" w:lineRule="auto"/>
+        <w:spacing w:after="40"/>
         <w:ind w:left="227"/>
       </w:pPr>
       <w:r>
@@ -544,7 +531,7 @@
     </w:p>
     <w:p>
       <w:pPr>
-        <w:spacing w:after="40" w:line="264" w:lineRule="auto"/>
+        <w:spacing w:after="40"/>
         <w:ind w:left="227"/>
       </w:pPr>
       <w:r>
@@ -560,7 +547,7 @@
     </w:p>
     <w:p>
       <w:pPr>
-        <w:spacing w:after="40" w:line="264" w:lineRule="auto"/>
+        <w:spacing w:after="40"/>
         <w:ind w:left="227"/>
       </w:pPr>
       <w:r>
@@ -576,7 +563,7 @@
     </w:p>
     <w:p>
       <w:pPr>
-        <w:spacing w:after="40" w:line="264" w:lineRule="auto"/>
+        <w:spacing w:after="40"/>
         <w:ind w:left="227"/>
       </w:pPr>
       <w:r>
@@ -592,7 +579,7 @@
     </w:p>
     <w:p>
       <w:pPr>
-        <w:spacing w:after="40" w:line="264" w:lineRule="auto"/>
+        <w:spacing w:after="40"/>
         <w:ind w:left="227"/>
       </w:pPr>
       <w:r>
@@ -609,7 +596,6 @@
     <w:p>
       <w:pPr>
         <w:spacing w:after="80" w:line="276" w:lineRule="auto"/>
-        <w:ind w:firstLine="0"/>
       </w:pPr>
       <w:r>
         <w:rPr>
@@ -624,7 +610,7 @@
     </w:p>
     <w:p>
       <w:pPr>
-        <w:spacing w:after="40" w:line="264" w:lineRule="auto"/>
+        <w:spacing w:after="40"/>
         <w:ind w:left="227"/>
       </w:pPr>
       <w:r>
@@ -640,7 +626,7 @@
     </w:p>
     <w:p>
       <w:pPr>
-        <w:spacing w:after="40" w:line="264" w:lineRule="auto"/>
+        <w:spacing w:after="40"/>
         <w:ind w:left="227"/>
       </w:pPr>
       <w:r>
@@ -656,7 +642,7 @@
     </w:p>
     <w:p>
       <w:pPr>
-        <w:spacing w:after="40" w:line="264" w:lineRule="auto"/>
+        <w:spacing w:after="40"/>
         <w:ind w:left="227"/>
       </w:pPr>
       <w:r>
@@ -672,7 +658,7 @@
     </w:p>
     <w:p>
       <w:pPr>
-        <w:spacing w:after="40" w:line="264" w:lineRule="auto"/>
+        <w:spacing w:after="40"/>
         <w:ind w:left="227"/>
       </w:pPr>
       <w:r>
@@ -688,7 +674,7 @@
     </w:p>
     <w:p>
       <w:pPr>
-        <w:spacing w:after="40" w:line="264" w:lineRule="auto"/>
+        <w:spacing w:after="40"/>
         <w:ind w:left="227"/>
       </w:pPr>
       <w:r>
@@ -704,7 +690,7 @@
     </w:p>
     <w:p>
       <w:pPr>
-        <w:spacing w:after="40" w:line="264" w:lineRule="auto"/>
+        <w:spacing w:after="40"/>
         <w:ind w:left="227"/>
       </w:pPr>
       <w:r>
@@ -721,7 +707,6 @@
     <w:p>
       <w:pPr>
         <w:spacing w:after="80" w:line="276" w:lineRule="auto"/>
-        <w:ind w:firstLine="0"/>
       </w:pPr>
       <w:r>
         <w:rPr>
@@ -736,7 +721,7 @@
     </w:p>
     <w:p>
       <w:pPr>
-        <w:spacing w:after="40" w:line="264" w:lineRule="auto"/>
+        <w:spacing w:after="40"/>
         <w:ind w:left="227"/>
       </w:pPr>
       <w:r>
@@ -752,7 +737,7 @@
     </w:p>
     <w:p>
       <w:pPr>
-        <w:spacing w:after="40" w:line="264" w:lineRule="auto"/>
+        <w:spacing w:after="40"/>
         <w:ind w:left="227"/>
       </w:pPr>
       <w:r>
@@ -768,7 +753,7 @@
     </w:p>
     <w:p>
       <w:pPr>
-        <w:spacing w:after="40" w:line="264" w:lineRule="auto"/>
+        <w:spacing w:after="40"/>
         <w:ind w:left="227"/>
       </w:pPr>
       <w:r>
@@ -784,7 +769,7 @@
     </w:p>
     <w:p>
       <w:pPr>
-        <w:spacing w:after="40" w:line="264" w:lineRule="auto"/>
+        <w:spacing w:after="40"/>
         <w:ind w:left="227"/>
       </w:pPr>
       <w:r>
@@ -800,7 +785,7 @@
     </w:p>
     <w:p>
       <w:pPr>
-        <w:spacing w:after="40" w:line="264" w:lineRule="auto"/>
+        <w:spacing w:after="40"/>
         <w:ind w:left="227"/>
       </w:pPr>
       <w:r>
@@ -816,7 +801,7 @@
     </w:p>
     <w:p>
       <w:pPr>
-        <w:spacing w:after="40" w:line="264" w:lineRule="auto"/>
+        <w:spacing w:after="40"/>
         <w:ind w:left="227"/>
       </w:pPr>
       <w:r>
@@ -833,7 +818,6 @@
     <w:p>
       <w:pPr>
         <w:spacing w:after="80" w:line="276" w:lineRule="auto"/>
-        <w:ind w:firstLine="0"/>
       </w:pPr>
       <w:r>
         <w:rPr>
@@ -848,7 +832,7 @@
     </w:p>
     <w:p>
       <w:pPr>
-        <w:spacing w:after="40" w:line="264" w:lineRule="auto"/>
+        <w:spacing w:after="40"/>
         <w:ind w:left="227"/>
       </w:pPr>
       <w:r>
@@ -864,7 +848,7 @@
     </w:p>
     <w:p>
       <w:pPr>
-        <w:spacing w:after="40" w:line="264" w:lineRule="auto"/>
+        <w:spacing w:after="40"/>
         <w:ind w:left="227"/>
       </w:pPr>
       <w:r>
@@ -880,7 +864,7 @@
     </w:p>
     <w:p>
       <w:pPr>
-        <w:spacing w:after="40" w:line="264" w:lineRule="auto"/>
+        <w:spacing w:after="40"/>
         <w:ind w:left="227"/>
       </w:pPr>
       <w:r>
@@ -896,7 +880,7 @@
     </w:p>
     <w:p>
       <w:pPr>
-        <w:spacing w:after="40" w:line="264" w:lineRule="auto"/>
+        <w:spacing w:after="40"/>
         <w:ind w:left="227"/>
       </w:pPr>
       <w:r>
@@ -913,7 +897,6 @@
     <w:p>
       <w:pPr>
         <w:spacing w:after="80" w:line="276" w:lineRule="auto"/>
-        <w:ind w:firstLine="0"/>
       </w:pPr>
       <w:r>
         <w:rPr>
@@ -928,7 +911,7 @@
     </w:p>
     <w:p>
       <w:pPr>
-        <w:spacing w:after="40" w:line="264" w:lineRule="auto"/>
+        <w:spacing w:after="40"/>
         <w:ind w:left="227"/>
       </w:pPr>
       <w:r>
@@ -944,7 +927,7 @@
     </w:p>
     <w:p>
       <w:pPr>
-        <w:spacing w:after="40" w:line="264" w:lineRule="auto"/>
+        <w:spacing w:after="40"/>
         <w:ind w:left="227"/>
       </w:pPr>
       <w:r>
@@ -960,7 +943,7 @@
     </w:p>
     <w:p>
       <w:pPr>
-        <w:spacing w:after="40" w:line="264" w:lineRule="auto"/>
+        <w:spacing w:after="40"/>
         <w:ind w:left="227"/>
       </w:pPr>
       <w:r>
@@ -976,7 +959,7 @@
     </w:p>
     <w:p>
       <w:pPr>
-        <w:spacing w:after="40" w:line="264" w:lineRule="auto"/>
+        <w:spacing w:after="40"/>
         <w:ind w:left="227"/>
       </w:pPr>
       <w:r>
@@ -992,7 +975,7 @@
     </w:p>
     <w:p>
       <w:pPr>
-        <w:spacing w:after="40" w:line="264" w:lineRule="auto"/>
+        <w:spacing w:after="40"/>
         <w:ind w:left="227"/>
       </w:pPr>
       <w:r>
@@ -1008,7 +991,7 @@
     </w:p>
     <w:p>
       <w:pPr>
-        <w:spacing w:after="40" w:line="264" w:lineRule="auto"/>
+        <w:spacing w:after="40"/>
         <w:ind w:left="227"/>
       </w:pPr>
       <w:r>
@@ -1025,7 +1008,6 @@
     <w:p>
       <w:pPr>
         <w:spacing w:after="80" w:line="276" w:lineRule="auto"/>
-        <w:ind w:firstLine="0"/>
       </w:pPr>
       <w:r>
         <w:rPr>
@@ -1040,7 +1022,7 @@
     </w:p>
     <w:p>
       <w:pPr>
-        <w:spacing w:after="40" w:line="264" w:lineRule="auto"/>
+        <w:spacing w:after="40"/>
         <w:ind w:left="227"/>
       </w:pPr>
       <w:r>
@@ -1056,7 +1038,7 @@
     </w:p>
     <w:p>
       <w:pPr>
-        <w:spacing w:after="40" w:line="264" w:lineRule="auto"/>
+        <w:spacing w:after="40"/>
         <w:ind w:left="227"/>
       </w:pPr>
       <w:r>
@@ -1072,7 +1054,7 @@
     </w:p>
     <w:p>
       <w:pPr>
-        <w:spacing w:after="40" w:line="264" w:lineRule="auto"/>
+        <w:spacing w:after="40"/>
         <w:ind w:left="227"/>
       </w:pPr>
       <w:r>
@@ -1088,7 +1070,7 @@
     </w:p>
     <w:p>
       <w:pPr>
-        <w:spacing w:after="40" w:line="264" w:lineRule="auto"/>
+        <w:spacing w:after="40"/>
         <w:ind w:left="227"/>
       </w:pPr>
       <w:r>
@@ -1104,7 +1086,7 @@
     </w:p>
     <w:p>
       <w:pPr>
-        <w:spacing w:after="40" w:line="264" w:lineRule="auto"/>
+        <w:spacing w:after="40"/>
         <w:ind w:left="227"/>
       </w:pPr>
       <w:r>
@@ -1121,7 +1103,6 @@
     <w:p>
       <w:pPr>
         <w:spacing w:after="80" w:line="276" w:lineRule="auto"/>
-        <w:ind w:firstLine="0"/>
       </w:pPr>
       <w:r>
         <w:rPr>
@@ -1152,7 +1133,6 @@
     <w:p>
       <w:pPr>
         <w:spacing w:after="80" w:line="276" w:lineRule="auto"/>
-        <w:ind w:firstLine="0"/>
       </w:pPr>
       <w:r>
         <w:rPr>
@@ -1167,7 +1147,7 @@
     </w:p>
     <w:p>
       <w:pPr>
-        <w:spacing w:after="40" w:line="264" w:lineRule="auto"/>
+        <w:spacing w:after="40"/>
         <w:ind w:left="227"/>
       </w:pPr>
       <w:r>
@@ -1183,7 +1163,7 @@
     </w:p>
     <w:p>
       <w:pPr>
-        <w:spacing w:after="40" w:line="264" w:lineRule="auto"/>
+        <w:spacing w:after="40"/>
         <w:ind w:left="227"/>
       </w:pPr>
       <w:r>
@@ -1199,7 +1179,7 @@
     </w:p>
     <w:p>
       <w:pPr>
-        <w:spacing w:after="40" w:line="264" w:lineRule="auto"/>
+        <w:spacing w:after="40"/>
         <w:ind w:left="227"/>
       </w:pPr>
       <w:r>
@@ -1215,7 +1195,7 @@
     </w:p>
     <w:p>
       <w:pPr>
-        <w:spacing w:after="40" w:line="264" w:lineRule="auto"/>
+        <w:spacing w:after="40"/>
         <w:ind w:left="227"/>
       </w:pPr>
       <w:r>
@@ -1231,7 +1211,7 @@
     </w:p>
     <w:p>
       <w:pPr>
-        <w:spacing w:after="40" w:line="264" w:lineRule="auto"/>
+        <w:spacing w:after="40"/>
         <w:ind w:left="227"/>
       </w:pPr>
       <w:r>
@@ -1247,7 +1227,7 @@
     </w:p>
     <w:p>
       <w:pPr>
-        <w:spacing w:after="40" w:line="264" w:lineRule="auto"/>
+        <w:spacing w:after="40"/>
         <w:ind w:left="227"/>
       </w:pPr>
       <w:r>
@@ -1263,7 +1243,7 @@
     </w:p>
     <w:p>
       <w:pPr>
-        <w:spacing w:after="40" w:line="264" w:lineRule="auto"/>
+        <w:spacing w:after="40"/>
         <w:ind w:left="227"/>
       </w:pPr>
       <w:r>
@@ -1279,7 +1259,7 @@
     </w:p>
     <w:p>
       <w:pPr>
-        <w:spacing w:after="40" w:line="264" w:lineRule="auto"/>
+        <w:spacing w:after="40"/>
         <w:ind w:left="227"/>
       </w:pPr>
       <w:r>
@@ -1296,7 +1276,6 @@
     <w:p>
       <w:pPr>
         <w:spacing w:after="80" w:line="276" w:lineRule="auto"/>
-        <w:ind w:firstLine="0"/>
       </w:pPr>
       <w:r>
         <w:rPr>
@@ -1326,7 +1305,7 @@
     </w:p>
     <w:p>
       <w:pPr>
-        <w:spacing w:after="40" w:line="264" w:lineRule="auto"/>
+        <w:spacing w:after="40"/>
         <w:ind w:left="227"/>
       </w:pPr>
       <w:r>
@@ -1342,7 +1321,7 @@
     </w:p>
     <w:p>
       <w:pPr>
-        <w:spacing w:after="40" w:line="264" w:lineRule="auto"/>
+        <w:spacing w:after="40"/>
         <w:ind w:left="227"/>
       </w:pPr>
       <w:r>
@@ -1358,7 +1337,7 @@
     </w:p>
     <w:p>
       <w:pPr>
-        <w:spacing w:after="40" w:line="264" w:lineRule="auto"/>
+        <w:spacing w:after="40"/>
         <w:ind w:left="227"/>
       </w:pPr>
       <w:r>
@@ -1374,7 +1353,7 @@
     </w:p>
     <w:p>
       <w:pPr>
-        <w:spacing w:after="40" w:line="264" w:lineRule="auto"/>
+        <w:spacing w:after="40"/>
         <w:ind w:left="227"/>
       </w:pPr>
       <w:r>
@@ -1390,7 +1369,7 @@
     </w:p>
     <w:p>
       <w:pPr>
-        <w:spacing w:after="40" w:line="264" w:lineRule="auto"/>
+        <w:spacing w:after="40"/>
         <w:ind w:left="227"/>
       </w:pPr>
       <w:r>
@@ -1421,7 +1400,7 @@
     </w:p>
     <w:p>
       <w:pPr>
-        <w:spacing w:after="40" w:line="264" w:lineRule="auto"/>
+        <w:spacing w:after="40"/>
         <w:ind w:left="227"/>
       </w:pPr>
       <w:r>
@@ -1437,7 +1416,7 @@
     </w:p>
     <w:p>
       <w:pPr>
-        <w:spacing w:after="40" w:line="264" w:lineRule="auto"/>
+        <w:spacing w:after="40"/>
         <w:ind w:left="227"/>
       </w:pPr>
       <w:r>
@@ -1453,7 +1432,7 @@
     </w:p>
     <w:p>
       <w:pPr>
-        <w:spacing w:after="40" w:line="264" w:lineRule="auto"/>
+        <w:spacing w:after="40"/>
         <w:ind w:left="227"/>
       </w:pPr>
       <w:r>
@@ -1469,7 +1448,7 @@
     </w:p>
     <w:p>
       <w:pPr>
-        <w:spacing w:after="40" w:line="264" w:lineRule="auto"/>
+        <w:spacing w:after="40"/>
         <w:ind w:left="227"/>
       </w:pPr>
       <w:r>
@@ -1485,7 +1464,7 @@
     </w:p>
     <w:p>
       <w:pPr>
-        <w:spacing w:after="40" w:line="264" w:lineRule="auto"/>
+        <w:spacing w:after="40"/>
         <w:ind w:left="227"/>
       </w:pPr>
       <w:r>
@@ -1511,12 +1490,27 @@
           <w:color w:val="A10F14"/>
           <w:sz w:val="24"/>
         </w:rPr>
-        <w:t>8. Investimento e condição comercial (referência)</w:t>
+        <w:t>8. Investimento e forma de pagamento</w:t>
       </w:r>
     </w:p>
     <w:p>
       <w:pPr>
-        <w:spacing w:after="40" w:line="264" w:lineRule="auto"/>
+        <w:spacing w:after="80" w:line="276" w:lineRule="auto"/>
+      </w:pPr>
+      <w:r>
+        <w:rPr>
+          <w:rFonts w:ascii="Calibri" w:hAnsi="Calibri" w:eastAsia="Calibri"/>
+          <w:b/>
+          <w:i w:val="0"/>
+          <w:color w:val="1A1A1A"/>
+          <w:sz w:val="22"/>
+        </w:rPr>
+        <w:t>8.1. Valores</w:t>
+      </w:r>
+    </w:p>
+    <w:p>
+      <w:pPr>
+        <w:spacing w:after="40"/>
         <w:ind w:left="227"/>
       </w:pPr>
       <w:r>
@@ -1527,12 +1521,12 @@
           <w:color w:val="1A1A1A"/>
           <w:sz w:val="22"/>
         </w:rPr>
-        <w:t>•  Valor de referência do produto: R$ 89.635,85.</w:t>
+        <w:t>•  Valor de referência do produto: R$ 89.635,85 (oitenta e nove mil, seiscentos e trinta e cinco reais e oitenta e cinco centavos).</w:t>
       </w:r>
     </w:p>
     <w:p>
       <w:pPr>
-        <w:spacing w:after="40" w:line="264" w:lineRule="auto"/>
+        <w:spacing w:after="40"/>
         <w:ind w:left="227"/>
       </w:pPr>
       <w:r>
@@ -1543,12 +1537,27 @@
           <w:color w:val="1A1A1A"/>
           <w:sz w:val="22"/>
         </w:rPr>
-        <w:t>•  Condição comercial G6 acordada na proposta: R$ 71.582,32.</w:t>
+        <w:t>•  Condição comercial G6 acordada: R$ 71.582,32 (setenta e um mil, quinhentos e oitenta e dois reais e trinta e dois centavos).</w:t>
       </w:r>
     </w:p>
     <w:p>
       <w:pPr>
-        <w:spacing w:after="40" w:line="264" w:lineRule="auto"/>
+        <w:spacing w:after="80" w:line="276" w:lineRule="auto"/>
+      </w:pPr>
+      <w:r>
+        <w:rPr>
+          <w:rFonts w:ascii="Calibri" w:hAnsi="Calibri" w:eastAsia="Calibri"/>
+          <w:b/>
+          <w:i w:val="0"/>
+          <w:color w:val="1A1A1A"/>
+          <w:sz w:val="22"/>
+        </w:rPr>
+        <w:t>8.2. Forma de pagamento (combinada entre as Partes)</w:t>
+      </w:r>
+    </w:p>
+    <w:p>
+      <w:pPr>
+        <w:spacing w:after="40"/>
         <w:ind w:left="227"/>
       </w:pPr>
       <w:r>
@@ -1559,13 +1568,76 @@
           <w:color w:val="1A1A1A"/>
           <w:sz w:val="22"/>
         </w:rPr>
-        <w:t>•  Condições de pagamento, reajuste, multa e vigência: conforme cláusulas do Contrato principal / proposta comercial assinada.</w:t>
+        <w:t>•  Entrada de R$ 20.000,00 (vinte mil reais), devida na assinatura / início do projeto, conforme orientação de faturamento da Contratada.</w:t>
       </w:r>
     </w:p>
     <w:p>
       <w:pPr>
+        <w:spacing w:after="40"/>
+        <w:ind w:left="227"/>
+      </w:pPr>
+      <w:r>
+        <w:rPr>
+          <w:rFonts w:ascii="Calibri" w:hAnsi="Calibri" w:eastAsia="Calibri"/>
+          <w:b w:val="0"/>
+          <w:i w:val="0"/>
+          <w:color w:val="1A1A1A"/>
+          <w:sz w:val="22"/>
+        </w:rPr>
+        <w:t>•  Saldo remanescente de R$ 51.582,32 (cinquenta e um mil, quinhentos e oitenta e dois reais e trinta e dois centavos), em 6 (seis) parcelas mensais via boleto bancário.</w:t>
+      </w:r>
+    </w:p>
+    <w:p>
+      <w:pPr>
+        <w:spacing w:after="40"/>
+        <w:ind w:left="227"/>
+      </w:pPr>
+      <w:r>
+        <w:rPr>
+          <w:rFonts w:ascii="Calibri" w:hAnsi="Calibri" w:eastAsia="Calibri"/>
+          <w:b w:val="0"/>
+          <w:i w:val="0"/>
+          <w:color w:val="1A1A1A"/>
+          <w:sz w:val="22"/>
+        </w:rPr>
+        <w:t>•  Valor de referência de cada parcela: R$ 8.597,05 (oito mil, quinhentos e noventa e sete reais e cinco centavos), com eventual ajuste de centavos na última parcela para totalizar exatamente o saldo de R$ 51.582,32.</w:t>
+      </w:r>
+    </w:p>
+    <w:p>
+      <w:pPr>
+        <w:spacing w:after="40"/>
+        <w:ind w:left="227"/>
+      </w:pPr>
+      <w:r>
+        <w:rPr>
+          <w:rFonts w:ascii="Calibri" w:hAnsi="Calibri" w:eastAsia="Calibri"/>
+          <w:b w:val="0"/>
+          <w:i w:val="0"/>
+          <w:color w:val="1A1A1A"/>
+          <w:sz w:val="22"/>
+        </w:rPr>
+        <w:t>•  Os boletos serão emitidos pela Contratada com vencimentos mensais sucessivos, a partir da data combinada no faturamento.</w:t>
+      </w:r>
+    </w:p>
+    <w:p>
+      <w:pPr>
+        <w:spacing w:after="40"/>
+        <w:ind w:left="227"/>
+      </w:pPr>
+      <w:r>
+        <w:rPr>
+          <w:rFonts w:ascii="Calibri" w:hAnsi="Calibri" w:eastAsia="Calibri"/>
+          <w:b w:val="0"/>
+          <w:i w:val="0"/>
+          <w:color w:val="1A1A1A"/>
+          <w:sz w:val="22"/>
+        </w:rPr>
+        <w:t>•  A falta de pagamento de qualquer parcela poderá ensejar as medidas previstas no Contrato principal (encargos, suspensão e/ou rescisão), sem prejuízo das demais cominações legais.</w:t>
+      </w:r>
+    </w:p>
+    <w:p>
+      <w:pPr>
         <w:spacing w:after="80" w:line="276" w:lineRule="auto"/>
-        <w:ind w:firstLine="0"/>
       </w:pPr>
       <w:r>
         <w:rPr>
@@ -1575,7 +1647,7 @@
           <w:color w:val="1A1A1A"/>
           <w:sz w:val="20"/>
         </w:rPr>
-        <w:t>Em caso de divergência entre materiais de apresentação (deck/PDF) e o Contrato, prevalece o Contrato, integrado por esta Observação quanto à lista de entregáveis.</w:t>
+        <w:t>Condições complementares de reajuste, multa, mora e vigência: conforme cláusulas do Contrato principal. Em caso de divergência entre materiais de apresentação (deck/PDF) e o Contrato, prevalece o Contrato, integrado por esta Observação quanto à lista de entregáveis e à forma de pagamento aqui descrita.</w:t>
       </w:r>
     </w:p>
     <w:p>
@@ -1595,7 +1667,7 @@
     </w:p>
     <w:p>
       <w:pPr>
-        <w:spacing w:after="40" w:line="264" w:lineRule="auto"/>
+        <w:spacing w:after="40"/>
         <w:ind w:left="227"/>
       </w:pPr>
       <w:r>
@@ -1611,7 +1683,7 @@
     </w:p>
     <w:p>
       <w:pPr>
-        <w:spacing w:after="40" w:line="264" w:lineRule="auto"/>
+        <w:spacing w:after="40"/>
         <w:ind w:left="227"/>
       </w:pPr>
       <w:r>
@@ -1627,7 +1699,7 @@
     </w:p>
     <w:p>
       <w:pPr>
-        <w:spacing w:after="40" w:line="264" w:lineRule="auto"/>
+        <w:spacing w:after="40"/>
         <w:ind w:left="227"/>
       </w:pPr>
       <w:r>
@@ -1644,7 +1716,6 @@
     <w:p>
       <w:pPr>
         <w:spacing w:after="80" w:line="276" w:lineRule="auto"/>
-        <w:ind w:firstLine="0"/>
       </w:pPr>
       <w:r>
         <w:rPr>
@@ -1654,7 +1725,7 @@
           <w:color w:val="1A1A1A"/>
           <w:sz w:val="20"/>
         </w:rPr>
-        <w:t>Tais materiais servem de apoio comercial e alinhamento; a lista vinculante de entregáveis para execução é a constante nesta Observação.</w:t>
+        <w:t>Tais materiais servem de apoio comercial e alinhamento; a lista vinculante de entregáveis e a forma de pagamento para execução são as constantes nesta Observação.</w:t>
       </w:r>
     </w:p>
     <w:p>
@@ -1675,7 +1746,6 @@
     <w:p>
       <w:pPr>
         <w:spacing w:after="80" w:line="276" w:lineRule="auto"/>
-        <w:ind w:firstLine="0"/>
       </w:pPr>
       <w:r>
         <w:rPr>
@@ -1685,7 +1755,7 @@
           <w:color w:val="1A1A1A"/>
           <w:sz w:val="22"/>
         </w:rPr>
-        <w:t>As Partes reconhecem que os entregáveis acima correspondem ao combinado para a Estruturação Comercial G6 e autorizam a inclusão deste texto como anexo/observação ao Contrato correspondente.</w:t>
+        <w:t>As Partes reconhecem que os entregáveis e a forma de pagamento acima correspondem ao combinado para a Estruturação Comercial G6 e autorizam a inclusão deste texto como anexo/observação ao Contrato correspondente.</w:t>
       </w:r>
     </w:p>
     <w:p>
@@ -1707,7 +1777,6 @@
     <w:p>
       <w:pPr>
         <w:spacing w:after="80" w:line="276" w:lineRule="auto"/>
-        <w:ind w:firstLine="0"/>
       </w:pPr>
       <w:r>
         <w:rPr>
@@ -1723,7 +1792,6 @@
     <w:p>
       <w:pPr>
         <w:spacing w:after="80" w:line="276" w:lineRule="auto"/>
-        <w:ind w:firstLine="0"/>
       </w:pPr>
       <w:r>
         <w:rPr>
@@ -1739,7 +1807,6 @@
     <w:p>
       <w:pPr>
         <w:spacing w:after="80" w:line="276" w:lineRule="auto"/>
-        <w:ind w:firstLine="0"/>
       </w:pPr>
       <w:r>
         <w:rPr>
@@ -1755,7 +1822,6 @@
     <w:p>
       <w:pPr>
         <w:spacing w:after="80" w:line="276" w:lineRule="auto"/>
-        <w:ind w:firstLine="0"/>
       </w:pPr>
       <w:r>
         <w:rPr>
@@ -1772,7 +1838,6 @@
     <w:p>
       <w:pPr>
         <w:spacing w:after="80" w:line="276" w:lineRule="auto"/>
-        <w:ind w:firstLine="0"/>
       </w:pPr>
       <w:r>
         <w:rPr>
@@ -1788,7 +1853,6 @@
     <w:p>
       <w:pPr>
         <w:spacing w:after="80" w:line="276" w:lineRule="auto"/>
-        <w:ind w:firstLine="0"/>
       </w:pPr>
       <w:r>
         <w:rPr>
@@ -1804,7 +1868,6 @@
     <w:p>
       <w:pPr>
         <w:spacing w:after="80" w:line="276" w:lineRule="auto"/>
-        <w:ind w:firstLine="0"/>
       </w:pPr>
       <w:r>
         <w:rPr>
@@ -1820,7 +1883,6 @@
     <w:p>
       <w:pPr>
         <w:spacing w:after="80" w:line="276" w:lineRule="auto"/>
-        <w:ind w:firstLine="0"/>
       </w:pPr>
       <w:r>
         <w:rPr>

</xml_diff>

<commit_message>
Update G6 contract terms: R$69.867,88 with Pix + 6x boleto
Co-authored-by: sarapizzico-hue <sarapizzico-hue@users.noreply.github.com>
</commit_message>
<xml_diff>
--- a/OBSERVACAO-CONTRATO-ENTREGAVEIS-G6.docx
+++ b/OBSERVACAO-CONTRATO-ENTREGAVEIS-G6.docx
@@ -14,7 +14,7 @@
           <w:color w:val="A10F14"/>
           <w:sz w:val="32"/>
         </w:rPr>
-        <w:t>OBSERVAÇÃO AO CONTRATO — ENTREGÁVEIS ACORDADOS</w:t>
+        <w:t>OBSERVAÇÃO AO CONTRATO — ENTREGÁVEIS E PAGAMENTO ACORDADOS</w:t>
       </w:r>
     </w:p>
     <w:p>
@@ -69,12 +69,12 @@
       <w:r>
         <w:rPr>
           <w:rFonts w:ascii="Calibri" w:hAnsi="Calibri" w:eastAsia="Calibri"/>
-          <w:b w:val="0"/>
+          <w:b/>
           <w:i w:val="0"/>
           <w:color w:val="1A1A1A"/>
           <w:sz w:val="22"/>
         </w:rPr>
-        <w:t>Referência comercial: proposta personalizada G6 · condição R$ 71.582,32 (referência R$ 89.635,85)</w:t>
+        <w:t>Valor acordado: R$ 69.867,88 (sessenta e nove mil, oitocentos e sessenta e sete reais e oitenta e oito centavos)</w:t>
       </w:r>
     </w:p>
     <w:p>
@@ -104,7 +104,7 @@
           <w:color w:val="1A1A1A"/>
           <w:sz w:val="20"/>
         </w:rPr>
-        <w:t>A presente Observação integra o instrumento contratual e descreve, de forma consolidada, os entregáveis, o formato de execução, a forma de pagamento e os critérios de sucesso combinados entre as Partes para o projeto de Estruturação Comercial da G6 Internet.</w:t>
+        <w:t>A presente Observação integra o instrumento contratual e descreve o escopo completo combinado, o formato de execução, a forma de pagamento e os critérios de sucesso do projeto de Estruturação Comercial da G6 Internet.</w:t>
       </w:r>
     </w:p>
     <w:p>
@@ -149,7 +149,7 @@
           <w:color w:val="1A1A1A"/>
           <w:sz w:val="22"/>
         </w:rPr>
-        <w:t>Fica expresso que o objeto não se limita à entrega de documentos ou treinamentos pontuais: o compromisso é de capacidade instalada na operação, com adesão assistida do time.</w:t>
+        <w:t>Fica expresso que o objeto não se limita à entrega de documentos ou treinamentos pontuais: o compromisso é de capacidade instalada na operação, com adesão assistida do time. Todo o escopo descrito nesta Observação está incluído no valor acordado.</w:t>
       </w:r>
     </w:p>
     <w:p>
@@ -307,7 +307,7 @@
           <w:color w:val="A10F14"/>
           <w:sz w:val="24"/>
         </w:rPr>
-        <w:t>3. Escopo consolidado (o que fica instalado)</w:t>
+        <w:t>3. Escopo consolidado (tudo incluído no valor acordado)</w:t>
       </w:r>
     </w:p>
     <w:p>
@@ -480,7 +480,7 @@
           <w:color w:val="A10F14"/>
           <w:sz w:val="24"/>
         </w:rPr>
-        <w:t>4. Fases, horas e entregáveis por fase</w:t>
+        <w:t>4. Fases, horas e entregáveis por fase (escopo completo)</w:t>
       </w:r>
     </w:p>
     <w:p>
@@ -495,7 +495,7 @@
           <w:color w:val="1A1A1A"/>
           <w:sz w:val="22"/>
         </w:rPr>
-        <w:t>As horas abaixo são a composição acordada do projeto (total 106,5h, incluindo 6h de gestão de projeto, QA e alinhamentos internos).</w:t>
+        <w:t>Composição acordada do projeto: total 106,5h (incluindo 6h de gestão de projeto, QA e alinhamentos internos).</w:t>
       </w:r>
     </w:p>
     <w:p>
@@ -1142,7 +1142,7 @@
           <w:color w:val="1A1A1A"/>
           <w:sz w:val="22"/>
         </w:rPr>
-        <w:t>Para fins de acompanhamento do resultado esperado do projeto, as Partes consideram como referência de sucesso a operação evidenciar, ao final da implantação assistida, os seguintes comportamentos/artefatos:</w:t>
+        <w:t>Referência de acompanhamento ao final da implantação assistida:</w:t>
       </w:r>
     </w:p>
     <w:p>
@@ -1285,7 +1285,7 @@
           <w:color w:val="1A1A1A"/>
           <w:sz w:val="20"/>
         </w:rPr>
-        <w:t>Os critérios acima orientam a qualidade da instalação e o acompanhamento conjunto; não constituem garantia de resultado financeiro específico (receita, churn ou ROI), os quais dependem também da execução contínua da Contratante após o handover.</w:t>
+        <w:t>Os critérios acima orientam a qualidade da instalação; não constituem garantia de resultado financeiro específico (receita, churn ou ROI), dependente também da execução contínua da Contratante após o handover.</w:t>
       </w:r>
     </w:p>
     <w:p>
@@ -1490,7 +1490,7 @@
           <w:color w:val="A10F14"/>
           <w:sz w:val="24"/>
         </w:rPr>
-        <w:t>8. Investimento e forma de pagamento</w:t>
+        <w:t>8. Valor acordado e forma de pagamento</w:t>
       </w:r>
     </w:p>
     <w:p>
@@ -1505,7 +1505,7 @@
           <w:color w:val="1A1A1A"/>
           <w:sz w:val="22"/>
         </w:rPr>
-        <w:t>8.1. Valores</w:t>
+        <w:t>8.1. Valor total acordado</w:t>
       </w:r>
     </w:p>
     <w:p>
@@ -1521,7 +1521,7 @@
           <w:color w:val="1A1A1A"/>
           <w:sz w:val="22"/>
         </w:rPr>
-        <w:t>•  Valor de referência do produto: R$ 89.635,85 (oitenta e nove mil, seiscentos e trinta e cinco reais e oitenta e cinco centavos).</w:t>
+        <w:t>•  Valor total do projeto (escopo completo desta Observação): R$ 69.867,88 (sessenta e nove mil, oitocentos e sessenta e sete reais e oitenta e oito centavos).</w:t>
       </w:r>
     </w:p>
     <w:p>
@@ -1537,7 +1537,7 @@
           <w:color w:val="1A1A1A"/>
           <w:sz w:val="22"/>
         </w:rPr>
-        <w:t>•  Condição comercial G6 acordada: R$ 71.582,32 (setenta e um mil, quinhentos e oitenta e dois reais e trinta e dois centavos).</w:t>
+        <w:t>•  O valor acima contempla integralmente o escopo das seções 2 a 5 desta Observação (formato, fundação operacional, controle/adesão, seis fases com entregáveis e critérios de Receita Previsível).</w:t>
       </w:r>
     </w:p>
     <w:p>
@@ -1552,7 +1552,7 @@
           <w:color w:val="1A1A1A"/>
           <w:sz w:val="22"/>
         </w:rPr>
-        <w:t>8.2. Forma de pagamento (combinada entre as Partes)</w:t>
+        <w:t>8.2. Forma de pagamento (ACORDADA)</w:t>
       </w:r>
     </w:p>
     <w:p>
@@ -1568,7 +1568,7 @@
           <w:color w:val="1A1A1A"/>
           <w:sz w:val="22"/>
         </w:rPr>
-        <w:t>•  Entrada de R$ 20.000,00 (vinte mil reais), devida na assinatura / início do projeto, conforme orientação de faturamento da Contratada.</w:t>
+        <w:t>•  Entrada de R$ 20.000,00 (vinte mil reais), via Pix, devida na assinatura / início do projeto, conforme chave e instruções de faturamento da Contratada.</w:t>
       </w:r>
     </w:p>
     <w:p>
@@ -1584,7 +1584,7 @@
           <w:color w:val="1A1A1A"/>
           <w:sz w:val="22"/>
         </w:rPr>
-        <w:t>•  Saldo remanescente de R$ 51.582,32 (cinquenta e um mil, quinhentos e oitenta e dois reais e trinta e dois centavos), em 6 (seis) parcelas mensais via boleto bancário.</w:t>
+        <w:t>•  Saldo em 6 (seis) parcelas mensais via boleto bancário, no valor de R$ 8.311,31 (oito mil, trezentos e onze reais e trinta e um centavos) cada.</w:t>
       </w:r>
     </w:p>
     <w:p>
@@ -1600,7 +1600,7 @@
           <w:color w:val="1A1A1A"/>
           <w:sz w:val="22"/>
         </w:rPr>
-        <w:t>•  Valor de referência de cada parcela: R$ 8.597,05 (oito mil, quinhentos e noventa e sete reais e cinco centavos), com eventual ajuste de centavos na última parcela para totalizar exatamente o saldo de R$ 51.582,32.</w:t>
+        <w:t>•  Resumo: Entrada R$ 20.000,00 (Pix) + 6× R$ 8.311,31 (boleto) = R$ 69.867,86; eventual diferença de R$ 0,02 para fechar R$ 69.867,88 será ajustada na última parcela do boleto.</w:t>
       </w:r>
     </w:p>
     <w:p>
@@ -1632,7 +1632,7 @@
           <w:color w:val="1A1A1A"/>
           <w:sz w:val="22"/>
         </w:rPr>
-        <w:t>•  A falta de pagamento de qualquer parcela poderá ensejar as medidas previstas no Contrato principal (encargos, suspensão e/ou rescisão), sem prejuízo das demais cominações legais.</w:t>
+        <w:t>•  A falta de pagamento da entrada ou de qualquer parcela poderá ensejar as medidas previstas no Contrato principal (encargos, suspensão e/ou rescisão), sem prejuízo das demais cominações legais.</w:t>
       </w:r>
     </w:p>
     <w:p>
@@ -1647,7 +1647,7 @@
           <w:color w:val="1A1A1A"/>
           <w:sz w:val="20"/>
         </w:rPr>
-        <w:t>Condições complementares de reajuste, multa, mora e vigência: conforme cláusulas do Contrato principal. Em caso de divergência entre materiais de apresentação (deck/PDF) e o Contrato, prevalece o Contrato, integrado por esta Observação quanto à lista de entregáveis e à forma de pagamento aqui descrita.</w:t>
+        <w:t>Condições complementares de reajuste, multa, mora e vigência: conforme cláusulas do Contrato principal. Em caso de divergência entre materiais de apresentação (deck/PDF) e o Contrato, prevalece o Contrato, integrado por esta Observação quanto ao escopo completo e à forma de pagamento aqui descritos.</w:t>
       </w:r>
     </w:p>
     <w:p>
@@ -1699,22 +1699,6 @@
     </w:p>
     <w:p>
       <w:pPr>
-        <w:spacing w:after="40"/>
-        <w:ind w:left="227"/>
-      </w:pPr>
-      <w:r>
-        <w:rPr>
-          <w:rFonts w:ascii="Calibri" w:hAnsi="Calibri" w:eastAsia="Calibri"/>
-          <w:b w:val="0"/>
-          <w:i w:val="0"/>
-          <w:color w:val="1A1A1A"/>
-          <w:sz w:val="22"/>
-        </w:rPr>
-        <w:t>•  Estrutura enxuta da entrega: ESTRUTURA-ENTREGA-G6.docx / .md</w:t>
-      </w:r>
-    </w:p>
-    <w:p>
-      <w:pPr>
         <w:spacing w:after="80" w:line="276" w:lineRule="auto"/>
       </w:pPr>
       <w:r>
@@ -1725,7 +1709,7 @@
           <w:color w:val="1A1A1A"/>
           <w:sz w:val="20"/>
         </w:rPr>
-        <w:t>Tais materiais servem de apoio comercial e alinhamento; a lista vinculante de entregáveis e a forma de pagamento para execução são as constantes nesta Observação.</w:t>
+        <w:t>Tais materiais servem de apoio comercial; o escopo vinculante e a forma de pagamento para execução são os desta Observação.</w:t>
       </w:r>
     </w:p>
     <w:p>
@@ -1755,7 +1739,7 @@
           <w:color w:val="1A1A1A"/>
           <w:sz w:val="22"/>
         </w:rPr>
-        <w:t>As Partes reconhecem que os entregáveis e a forma de pagamento acima correspondem ao combinado para a Estruturação Comercial G6 e autorizam a inclusão deste texto como anexo/observação ao Contrato correspondente.</w:t>
+        <w:t>As Partes reconhecem que o escopo completo e a forma de pagamento acima (valor total R$ 69.867,88; entrada R$ 20.000,00 via Pix; 6× R$ 8.311,31 no boleto) correspondem ao combinado para a Estruturação Comercial G6 e autorizam a inclusão deste texto como anexo/observação ao Contrato correspondente.</w:t>
       </w:r>
     </w:p>
     <w:p>

</xml_diff>

<commit_message>
Update G6 observation: agreed R$69.867,88 Pix+boleto + full scope
Co-authored-by: sarapizzico-hue <sarapizzico-hue@users.noreply.github.com>
</commit_message>
<xml_diff>
--- a/OBSERVACAO-CONTRATO-ENTREGAVEIS-G6.docx
+++ b/OBSERVACAO-CONTRATO-ENTREGAVEIS-G6.docx
@@ -14,7 +14,7 @@
           <w:color w:val="A10F14"/>
           <w:sz w:val="32"/>
         </w:rPr>
-        <w:t>OBSERVAÇÃO AO CONTRATO — ENTREGÁVEIS ACORDADOS</w:t>
+        <w:t>OBSERVAÇÃO AO CONTRATO — ENTREGÁVEIS E PAGAMENTO ACORDADOS</w:t>
       </w:r>
     </w:p>
     <w:p>
@@ -69,12 +69,12 @@
       <w:r>
         <w:rPr>
           <w:rFonts w:ascii="Calibri" w:hAnsi="Calibri" w:eastAsia="Calibri"/>
-          <w:b w:val="0"/>
+          <w:b/>
           <w:i w:val="0"/>
           <w:color w:val="1A1A1A"/>
           <w:sz w:val="22"/>
         </w:rPr>
-        <w:t>Referência comercial: proposta personalizada G6 · condição R$ 71.582,32 (referência R$ 89.635,85)</w:t>
+        <w:t>Valor acordado: R$ 69.867,88 (sessenta e nove mil, oitocentos e sessenta e sete reais e oitenta e oito centavos)</w:t>
       </w:r>
     </w:p>
     <w:p>
@@ -104,7 +104,7 @@
           <w:color w:val="1A1A1A"/>
           <w:sz w:val="20"/>
         </w:rPr>
-        <w:t>A presente Observação integra o instrumento contratual e descreve, de forma consolidada, os entregáveis, o formato de execução, a forma de pagamento e os critérios de sucesso combinados entre as Partes para o projeto de Estruturação Comercial da G6 Internet.</w:t>
+        <w:t>A presente Observação integra o instrumento contratual e descreve o escopo completo combinado, o formato de execução, a forma de pagamento e os critérios de sucesso do projeto de Estruturação Comercial da G6 Internet.</w:t>
       </w:r>
     </w:p>
     <w:p>
@@ -149,7 +149,7 @@
           <w:color w:val="1A1A1A"/>
           <w:sz w:val="22"/>
         </w:rPr>
-        <w:t>Fica expresso que o objeto não se limita à entrega de documentos ou treinamentos pontuais: o compromisso é de capacidade instalada na operação, com adesão assistida do time.</w:t>
+        <w:t>Fica expresso que o objeto não se limita à entrega de documentos ou treinamentos pontuais: o compromisso é de capacidade instalada na operação, com adesão assistida do time. Todo o escopo descrito nesta Observação está incluído no valor acordado.</w:t>
       </w:r>
     </w:p>
     <w:p>
@@ -307,7 +307,7 @@
           <w:color w:val="A10F14"/>
           <w:sz w:val="24"/>
         </w:rPr>
-        <w:t>3. Escopo consolidado (o que fica instalado)</w:t>
+        <w:t>3. Escopo consolidado (tudo incluído no valor acordado)</w:t>
       </w:r>
     </w:p>
     <w:p>
@@ -480,7 +480,7 @@
           <w:color w:val="A10F14"/>
           <w:sz w:val="24"/>
         </w:rPr>
-        <w:t>4. Fases, horas e entregáveis por fase</w:t>
+        <w:t>4. Fases, horas e entregáveis por fase (escopo completo)</w:t>
       </w:r>
     </w:p>
     <w:p>
@@ -495,7 +495,7 @@
           <w:color w:val="1A1A1A"/>
           <w:sz w:val="22"/>
         </w:rPr>
-        <w:t>As horas abaixo são a composição acordada do projeto (total 106,5h, incluindo 6h de gestão de projeto, QA e alinhamentos internos).</w:t>
+        <w:t>Composição acordada do projeto: total 106,5h (incluindo 6h de gestão de projeto, QA e alinhamentos internos).</w:t>
       </w:r>
     </w:p>
     <w:p>
@@ -1142,7 +1142,7 @@
           <w:color w:val="1A1A1A"/>
           <w:sz w:val="22"/>
         </w:rPr>
-        <w:t>Para fins de acompanhamento do resultado esperado do projeto, as Partes consideram como referência de sucesso a operação evidenciar, ao final da implantação assistida, os seguintes comportamentos/artefatos:</w:t>
+        <w:t>Referência de acompanhamento ao final da implantação assistida:</w:t>
       </w:r>
     </w:p>
     <w:p>
@@ -1285,7 +1285,7 @@
           <w:color w:val="1A1A1A"/>
           <w:sz w:val="20"/>
         </w:rPr>
-        <w:t>Os critérios acima orientam a qualidade da instalação e o acompanhamento conjunto; não constituem garantia de resultado financeiro específico (receita, churn ou ROI), os quais dependem também da execução contínua da Contratante após o handover.</w:t>
+        <w:t>Os critérios acima orientam a qualidade da instalação; não constituem garantia de resultado financeiro específico (receita, churn ou ROI), dependente também da execução contínua da Contratante após o handover.</w:t>
       </w:r>
     </w:p>
     <w:p>
@@ -1490,7 +1490,7 @@
           <w:color w:val="A10F14"/>
           <w:sz w:val="24"/>
         </w:rPr>
-        <w:t>8. Investimento e forma de pagamento</w:t>
+        <w:t>8. Valor acordado e forma de pagamento</w:t>
       </w:r>
     </w:p>
     <w:p>
@@ -1505,7 +1505,7 @@
           <w:color w:val="1A1A1A"/>
           <w:sz w:val="22"/>
         </w:rPr>
-        <w:t>8.1. Valores</w:t>
+        <w:t>8.1. Valor total acordado</w:t>
       </w:r>
     </w:p>
     <w:p>
@@ -1521,7 +1521,7 @@
           <w:color w:val="1A1A1A"/>
           <w:sz w:val="22"/>
         </w:rPr>
-        <w:t>•  Valor de referência do produto: R$ 89.635,85 (oitenta e nove mil, seiscentos e trinta e cinco reais e oitenta e cinco centavos).</w:t>
+        <w:t>•  Valor total do projeto (escopo completo desta Observação): R$ 69.867,88 (sessenta e nove mil, oitocentos e sessenta e sete reais e oitenta e oito centavos).</w:t>
       </w:r>
     </w:p>
     <w:p>
@@ -1537,7 +1537,7 @@
           <w:color w:val="1A1A1A"/>
           <w:sz w:val="22"/>
         </w:rPr>
-        <w:t>•  Condição comercial G6 acordada: R$ 71.582,32 (setenta e um mil, quinhentos e oitenta e dois reais e trinta e dois centavos).</w:t>
+        <w:t>•  O valor acima contempla integralmente o escopo das seções 2 a 5 desta Observação (formato, fundação operacional, controle/adesão, seis fases com entregáveis e critérios de Receita Previsível).</w:t>
       </w:r>
     </w:p>
     <w:p>
@@ -1552,7 +1552,7 @@
           <w:color w:val="1A1A1A"/>
           <w:sz w:val="22"/>
         </w:rPr>
-        <w:t>8.2. Forma de pagamento (combinada entre as Partes)</w:t>
+        <w:t>8.2. Forma de pagamento (ACORDADA)</w:t>
       </w:r>
     </w:p>
     <w:p>
@@ -1568,7 +1568,7 @@
           <w:color w:val="1A1A1A"/>
           <w:sz w:val="22"/>
         </w:rPr>
-        <w:t>•  Entrada de R$ 20.000,00 (vinte mil reais), devida na assinatura / início do projeto, conforme orientação de faturamento da Contratada.</w:t>
+        <w:t>•  Entrada de R$ 20.000,00 (vinte mil reais), via Pix, devida na assinatura / início do projeto, conforme chave e instruções de faturamento da Contratada.</w:t>
       </w:r>
     </w:p>
     <w:p>
@@ -1584,7 +1584,7 @@
           <w:color w:val="1A1A1A"/>
           <w:sz w:val="22"/>
         </w:rPr>
-        <w:t>•  Saldo remanescente de R$ 51.582,32 (cinquenta e um mil, quinhentos e oitenta e dois reais e trinta e dois centavos), em 6 (seis) parcelas mensais via boleto bancário.</w:t>
+        <w:t>•  Saldo em 6 (seis) parcelas mensais via boleto bancário, no valor de R$ 8.311,31 (oito mil, trezentos e onze reais e trinta e um centavos) cada.</w:t>
       </w:r>
     </w:p>
     <w:p>
@@ -1600,7 +1600,7 @@
           <w:color w:val="1A1A1A"/>
           <w:sz w:val="22"/>
         </w:rPr>
-        <w:t>•  Valor de referência de cada parcela: R$ 8.597,05 (oito mil, quinhentos e noventa e sete reais e cinco centavos), com eventual ajuste de centavos na última parcela para totalizar exatamente o saldo de R$ 51.582,32.</w:t>
+        <w:t>•  Resumo: Entrada R$ 20.000,00 (Pix) + 6× R$ 8.311,31 (boleto) = R$ 69.867,86; eventual diferença de R$ 0,02 para fechar R$ 69.867,88 será ajustada na última parcela do boleto.</w:t>
       </w:r>
     </w:p>
     <w:p>
@@ -1632,7 +1632,7 @@
           <w:color w:val="1A1A1A"/>
           <w:sz w:val="22"/>
         </w:rPr>
-        <w:t>•  A falta de pagamento de qualquer parcela poderá ensejar as medidas previstas no Contrato principal (encargos, suspensão e/ou rescisão), sem prejuízo das demais cominações legais.</w:t>
+        <w:t>•  A falta de pagamento da entrada ou de qualquer parcela poderá ensejar as medidas previstas no Contrato principal (encargos, suspensão e/ou rescisão), sem prejuízo das demais cominações legais.</w:t>
       </w:r>
     </w:p>
     <w:p>
@@ -1647,7 +1647,7 @@
           <w:color w:val="1A1A1A"/>
           <w:sz w:val="20"/>
         </w:rPr>
-        <w:t>Condições complementares de reajuste, multa, mora e vigência: conforme cláusulas do Contrato principal. Em caso de divergência entre materiais de apresentação (deck/PDF) e o Contrato, prevalece o Contrato, integrado por esta Observação quanto à lista de entregáveis e à forma de pagamento aqui descrita.</w:t>
+        <w:t>Condições complementares de reajuste, multa, mora e vigência: conforme cláusulas do Contrato principal. Em caso de divergência entre materiais de apresentação (deck/PDF) e o Contrato, prevalece o Contrato, integrado por esta Observação quanto ao escopo completo e à forma de pagamento aqui descritos.</w:t>
       </w:r>
     </w:p>
     <w:p>
@@ -1699,22 +1699,6 @@
     </w:p>
     <w:p>
       <w:pPr>
-        <w:spacing w:after="40"/>
-        <w:ind w:left="227"/>
-      </w:pPr>
-      <w:r>
-        <w:rPr>
-          <w:rFonts w:ascii="Calibri" w:hAnsi="Calibri" w:eastAsia="Calibri"/>
-          <w:b w:val="0"/>
-          <w:i w:val="0"/>
-          <w:color w:val="1A1A1A"/>
-          <w:sz w:val="22"/>
-        </w:rPr>
-        <w:t>•  Estrutura enxuta da entrega: ESTRUTURA-ENTREGA-G6.docx / .md</w:t>
-      </w:r>
-    </w:p>
-    <w:p>
-      <w:pPr>
         <w:spacing w:after="80" w:line="276" w:lineRule="auto"/>
       </w:pPr>
       <w:r>
@@ -1725,7 +1709,7 @@
           <w:color w:val="1A1A1A"/>
           <w:sz w:val="20"/>
         </w:rPr>
-        <w:t>Tais materiais servem de apoio comercial e alinhamento; a lista vinculante de entregáveis e a forma de pagamento para execução são as constantes nesta Observação.</w:t>
+        <w:t>Tais materiais servem de apoio comercial; o escopo vinculante e a forma de pagamento para execução são os desta Observação.</w:t>
       </w:r>
     </w:p>
     <w:p>
@@ -1755,7 +1739,7 @@
           <w:color w:val="1A1A1A"/>
           <w:sz w:val="22"/>
         </w:rPr>
-        <w:t>As Partes reconhecem que os entregáveis e a forma de pagamento acima correspondem ao combinado para a Estruturação Comercial G6 e autorizam a inclusão deste texto como anexo/observação ao Contrato correspondente.</w:t>
+        <w:t>As Partes reconhecem que o escopo completo e a forma de pagamento acima (valor total R$ 69.867,88; entrada R$ 20.000,00 via Pix; 6× R$ 8.311,31 no boleto) correspondem ao combinado para a Estruturação Comercial G6 e autorizam a inclusão deste texto como anexo/observação ao Contrato correspondente.</w:t>
       </w:r>
     </w:p>
     <w:p>

</xml_diff>